<commit_message>
Add test environment, schedule and test traceability
</commit_message>
<xml_diff>
--- a/test_plan.docx
+++ b/test_plan.docx
@@ -1645,6 +1645,702 @@
     </w:p>
     <w:p>
       <w:pPr>
+        <w:pStyle w:val="ListBullet"/>
+        <w:numPr>
+          <w:ilvl w:val="0"/>
+          <w:numId w:val="0"/>
+        </w:numPr>
+        <w:spacing w:after="40"/>
+        <w:ind w:left="360"/>
+      </w:pPr>
+    </w:p>
+    <w:p>
+      <w:pPr>
+        <w:pStyle w:val="Heading1"/>
+      </w:pPr>
+      <w:r>
+        <w:t>6. Test Environment</w:t>
+      </w:r>
+    </w:p>
+    <w:p>
+      <w:pPr>
+        <w:pStyle w:val="Heading2"/>
+      </w:pPr>
+      <w:r>
+        <w:t>6.1 Hardware</w:t>
+      </w:r>
+    </w:p>
+    <w:p>
+      <w:pPr>
+        <w:pStyle w:val="ListBullet"/>
+        <w:spacing w:after="40"/>
+      </w:pPr>
+      <w:r>
+        <w:t>Desktop computers</w:t>
+      </w:r>
+    </w:p>
+    <w:p>
+      <w:pPr>
+        <w:pStyle w:val="ListBullet"/>
+        <w:spacing w:after="40"/>
+      </w:pPr>
+      <w:r>
+        <w:t>Laptops</w:t>
+      </w:r>
+    </w:p>
+    <w:p>
+      <w:pPr>
+        <w:pStyle w:val="ListBullet"/>
+        <w:spacing w:after="40"/>
+      </w:pPr>
+      <w:r>
+        <w:t>Smartphones or other supported devices for UI testing</w:t>
+      </w:r>
+    </w:p>
+    <w:p>
+      <w:pPr>
+        <w:pStyle w:val="ListBullet"/>
+        <w:spacing w:after="40"/>
+      </w:pPr>
+      <w:r>
+        <w:t>Internet/network connection</w:t>
+      </w:r>
+    </w:p>
+    <w:p>
+      <w:pPr>
+        <w:pStyle w:val="Heading2"/>
+      </w:pPr>
+      <w:r>
+        <w:t>6.2 Software</w:t>
+      </w:r>
+    </w:p>
+    <w:p>
+      <w:pPr>
+        <w:pStyle w:val="ListBullet"/>
+        <w:spacing w:after="40"/>
+      </w:pPr>
+      <w:r>
+        <w:t>Book E-Commerce Platform v1.0</w:t>
+      </w:r>
+    </w:p>
+    <w:p>
+      <w:pPr>
+        <w:pStyle w:val="ListBullet"/>
+        <w:spacing w:after="40"/>
+      </w:pPr>
+      <w:r>
+        <w:t>MongoDB</w:t>
+      </w:r>
+    </w:p>
+    <w:p>
+      <w:pPr>
+        <w:pStyle w:val="ListBullet"/>
+        <w:spacing w:after="40"/>
+      </w:pPr>
+      <w:r>
+        <w:t>Node.js</w:t>
+      </w:r>
+    </w:p>
+    <w:p>
+      <w:pPr>
+        <w:pStyle w:val="ListBullet"/>
+        <w:spacing w:after="40"/>
+      </w:pPr>
+      <w:r>
+        <w:t>Express.js</w:t>
+      </w:r>
+    </w:p>
+    <w:p>
+      <w:pPr>
+        <w:pStyle w:val="ListBullet"/>
+        <w:spacing w:after="40"/>
+      </w:pPr>
+      <w:r>
+        <w:t>React.js</w:t>
+      </w:r>
+    </w:p>
+    <w:p>
+      <w:pPr>
+        <w:pStyle w:val="ListBullet"/>
+        <w:spacing w:after="40"/>
+      </w:pPr>
+      <w:r>
+        <w:t>Web browser such as Google Chrome or Microsoft Edge</w:t>
+      </w:r>
+    </w:p>
+    <w:p>
+      <w:pPr>
+        <w:pStyle w:val="ListBullet"/>
+        <w:spacing w:after="40"/>
+      </w:pPr>
+      <w:r>
+        <w:t>Development/test database</w:t>
+      </w:r>
+    </w:p>
+    <w:p>
+      <w:pPr>
+        <w:pStyle w:val="Heading2"/>
+      </w:pPr>
+      <w:r>
+        <w:t>6.3 Tools</w:t>
+      </w:r>
+    </w:p>
+    <w:p>
+      <w:pPr>
+        <w:pStyle w:val="ListBullet"/>
+        <w:spacing w:after="40"/>
+      </w:pPr>
+      <w:r>
+        <w:t>Browser Developer Tools</w:t>
+      </w:r>
+    </w:p>
+    <w:p>
+      <w:pPr>
+        <w:pStyle w:val="ListBullet"/>
+        <w:spacing w:after="40"/>
+      </w:pPr>
+      <w:r>
+        <w:t>Postman, if APIs are tested separately</w:t>
+      </w:r>
+    </w:p>
+    <w:p>
+      <w:pPr>
+        <w:pStyle w:val="ListBullet"/>
+        <w:spacing w:after="40"/>
+      </w:pPr>
+      <w:r>
+        <w:t>GitHub for version control and collaboration</w:t>
+      </w:r>
+    </w:p>
+    <w:p>
+      <w:pPr>
+        <w:pStyle w:val="ListBullet"/>
+        <w:spacing w:after="40"/>
+      </w:pPr>
+      <w:r>
+        <w:t>Appropriate test-case documentation</w:t>
+      </w:r>
+    </w:p>
+    <w:p>
+      <w:pPr>
+        <w:pStyle w:val="ListBullet"/>
+        <w:spacing w:after="40"/>
+      </w:pPr>
+      <w:r>
+        <w:t>Defect tracking through the project's selected issue-tracking method</w:t>
+      </w:r>
+    </w:p>
+    <w:p>
+      <w:pPr>
+        <w:pStyle w:val="Heading2"/>
+      </w:pPr>
+      <w:r>
+        <w:t>6.4 Test Data</w:t>
+      </w:r>
+    </w:p>
+    <w:p>
+      <w:r>
+        <w:t>The following test data will be prepared:</w:t>
+      </w:r>
+    </w:p>
+    <w:p>
+      <w:pPr>
+        <w:pStyle w:val="ListBullet"/>
+        <w:spacing w:after="40"/>
+      </w:pPr>
+      <w:r>
+        <w:t>Valid and invalid user registration details</w:t>
+      </w:r>
+    </w:p>
+    <w:p>
+      <w:pPr>
+        <w:pStyle w:val="ListBullet"/>
+        <w:spacing w:after="40"/>
+      </w:pPr>
+      <w:r>
+        <w:t>Valid and invalid login credentials</w:t>
+      </w:r>
+    </w:p>
+    <w:p>
+      <w:pPr>
+        <w:pStyle w:val="ListBullet"/>
+        <w:spacing w:after="40"/>
+      </w:pPr>
+      <w:r>
+        <w:t>Sample book details</w:t>
+      </w:r>
+    </w:p>
+    <w:p>
+      <w:pPr>
+        <w:pStyle w:val="ListBullet"/>
+        <w:spacing w:after="40"/>
+      </w:pPr>
+      <w:r>
+        <w:t>Different book categories and authors</w:t>
+      </w:r>
+    </w:p>
+    <w:p>
+      <w:pPr>
+        <w:pStyle w:val="ListBullet"/>
+        <w:spacing w:after="40"/>
+      </w:pPr>
+      <w:r>
+        <w:t>Different book prices and quantities</w:t>
+      </w:r>
+    </w:p>
+    <w:p>
+      <w:pPr>
+        <w:pStyle w:val="ListBullet"/>
+        <w:spacing w:after="40"/>
+      </w:pPr>
+      <w:r>
+        <w:t>Sample seller accounts</w:t>
+      </w:r>
+    </w:p>
+    <w:p>
+      <w:pPr>
+        <w:pStyle w:val="ListBullet"/>
+        <w:spacing w:after="40"/>
+      </w:pPr>
+      <w:r>
+        <w:t>Sample customer accounts</w:t>
+      </w:r>
+    </w:p>
+    <w:p>
+      <w:pPr>
+        <w:pStyle w:val="ListBullet"/>
+        <w:spacing w:after="40"/>
+      </w:pPr>
+      <w:r>
+        <w:t>Sample orders</w:t>
+      </w:r>
+    </w:p>
+    <w:p>
+      <w:pPr>
+        <w:pStyle w:val="ListBullet"/>
+        <w:spacing w:after="40"/>
+      </w:pPr>
+      <w:r>
+        <w:t>Payment success and failure scenarios</w:t>
+      </w:r>
+    </w:p>
+    <w:p>
+      <w:pPr>
+        <w:pStyle w:val="ListBullet"/>
+        <w:spacing w:after="40"/>
+      </w:pPr>
+      <w:r>
+        <w:t>Sample ratings and reviews</w:t>
+      </w:r>
+    </w:p>
+    <w:p>
+      <w:pPr>
+        <w:pStyle w:val="ListBullet"/>
+        <w:spacing w:after="40"/>
+      </w:pPr>
+      <w:r>
+        <w:t>Administrator account and unauthorized user accounts</w:t>
+      </w:r>
+    </w:p>
+    <w:p>
+      <w:pPr>
+        <w:pStyle w:val="Heading1"/>
+      </w:pPr>
+      <w:r>
+        <w:lastRenderedPageBreak/>
+        <w:t>7. Test Schedule</w:t>
+      </w:r>
+    </w:p>
+    <w:p>
+      <w:pPr>
+        <w:pStyle w:val="Heading2"/>
+      </w:pPr>
+      <w:r>
+        <w:t>7.1 Milestones</w:t>
+      </w:r>
+    </w:p>
+    <w:tbl>
+      <w:tblPr>
+        <w:tblStyle w:val="TableGrid"/>
+        <w:tblW w:w="10354" w:type="dxa"/>
+        <w:jc w:val="center"/>
+        <w:tblLook w:val="04A0" w:firstRow="1" w:lastRow="0" w:firstColumn="1" w:lastColumn="0" w:noHBand="0" w:noVBand="1"/>
+      </w:tblPr>
+      <w:tblGrid>
+        <w:gridCol w:w="5177"/>
+        <w:gridCol w:w="5177"/>
+      </w:tblGrid>
+      <w:tr>
+        <w:trPr>
+          <w:trHeight w:val="273"/>
+          <w:jc w:val="center"/>
+        </w:trPr>
+        <w:tc>
+          <w:tcPr>
+            <w:tcW w:w="5177" w:type="dxa"/>
+            <w:shd w:val="clear" w:color="auto" w:fill="D9EAF7"/>
+            <w:vAlign w:val="center"/>
+          </w:tcPr>
+          <w:p>
+            <w:r>
+              <w:rPr>
+                <w:b/>
+                <w:sz w:val="18"/>
+              </w:rPr>
+              <w:t>Activity</w:t>
+            </w:r>
+          </w:p>
+        </w:tc>
+        <w:tc>
+          <w:tcPr>
+            <w:tcW w:w="5177" w:type="dxa"/>
+            <w:shd w:val="clear" w:color="auto" w:fill="D9EAF7"/>
+            <w:vAlign w:val="center"/>
+          </w:tcPr>
+          <w:p>
+            <w:r>
+              <w:rPr>
+                <w:b/>
+                <w:sz w:val="18"/>
+              </w:rPr>
+              <w:t>Planned Schedule</w:t>
+            </w:r>
+          </w:p>
+        </w:tc>
+      </w:tr>
+      <w:tr>
+        <w:trPr>
+          <w:trHeight w:val="273"/>
+          <w:jc w:val="center"/>
+        </w:trPr>
+        <w:tc>
+          <w:tcPr>
+            <w:tcW w:w="5177" w:type="dxa"/>
+            <w:vAlign w:val="center"/>
+          </w:tcPr>
+          <w:p>
+            <w:r>
+              <w:rPr>
+                <w:sz w:val="18"/>
+              </w:rPr>
+              <w:t>Test plan preparation</w:t>
+            </w:r>
+          </w:p>
+        </w:tc>
+        <w:tc>
+          <w:tcPr>
+            <w:tcW w:w="5177" w:type="dxa"/>
+            <w:vAlign w:val="center"/>
+          </w:tcPr>
+          <w:p>
+            <w:r>
+              <w:rPr>
+                <w:sz w:val="18"/>
+              </w:rPr>
+              <w:t>After SRS completion</w:t>
+            </w:r>
+          </w:p>
+        </w:tc>
+      </w:tr>
+      <w:tr>
+        <w:trPr>
+          <w:trHeight w:val="273"/>
+          <w:jc w:val="center"/>
+        </w:trPr>
+        <w:tc>
+          <w:tcPr>
+            <w:tcW w:w="5177" w:type="dxa"/>
+            <w:vAlign w:val="center"/>
+          </w:tcPr>
+          <w:p>
+            <w:r>
+              <w:rPr>
+                <w:sz w:val="18"/>
+              </w:rPr>
+              <w:t>Test case design</w:t>
+            </w:r>
+          </w:p>
+        </w:tc>
+        <w:tc>
+          <w:tcPr>
+            <w:tcW w:w="5177" w:type="dxa"/>
+            <w:vAlign w:val="center"/>
+          </w:tcPr>
+          <w:p>
+            <w:r>
+              <w:rPr>
+                <w:sz w:val="18"/>
+              </w:rPr>
+              <w:t>After test plan completion</w:t>
+            </w:r>
+          </w:p>
+        </w:tc>
+      </w:tr>
+      <w:tr>
+        <w:trPr>
+          <w:trHeight w:val="273"/>
+          <w:jc w:val="center"/>
+        </w:trPr>
+        <w:tc>
+          <w:tcPr>
+            <w:tcW w:w="5177" w:type="dxa"/>
+            <w:vAlign w:val="center"/>
+          </w:tcPr>
+          <w:p>
+            <w:r>
+              <w:rPr>
+                <w:sz w:val="18"/>
+              </w:rPr>
+              <w:t>Test environment setup</w:t>
+            </w:r>
+          </w:p>
+        </w:tc>
+        <w:tc>
+          <w:tcPr>
+            <w:tcW w:w="5177" w:type="dxa"/>
+            <w:vAlign w:val="center"/>
+          </w:tcPr>
+          <w:p>
+            <w:r>
+              <w:rPr>
+                <w:sz w:val="18"/>
+              </w:rPr>
+              <w:t>Before test execution</w:t>
+            </w:r>
+          </w:p>
+        </w:tc>
+      </w:tr>
+      <w:tr>
+        <w:trPr>
+          <w:trHeight w:val="273"/>
+          <w:jc w:val="center"/>
+        </w:trPr>
+        <w:tc>
+          <w:tcPr>
+            <w:tcW w:w="5177" w:type="dxa"/>
+            <w:vAlign w:val="center"/>
+          </w:tcPr>
+          <w:p>
+            <w:r>
+              <w:rPr>
+                <w:sz w:val="18"/>
+              </w:rPr>
+              <w:t>Test execution</w:t>
+            </w:r>
+          </w:p>
+        </w:tc>
+        <w:tc>
+          <w:tcPr>
+            <w:tcW w:w="5177" w:type="dxa"/>
+            <w:vAlign w:val="center"/>
+          </w:tcPr>
+          <w:p>
+            <w:r>
+              <w:rPr>
+                <w:sz w:val="18"/>
+              </w:rPr>
+              <w:t>After stable build is available</w:t>
+            </w:r>
+          </w:p>
+        </w:tc>
+      </w:tr>
+      <w:tr>
+        <w:trPr>
+          <w:trHeight w:val="273"/>
+          <w:jc w:val="center"/>
+        </w:trPr>
+        <w:tc>
+          <w:tcPr>
+            <w:tcW w:w="5177" w:type="dxa"/>
+            <w:vAlign w:val="center"/>
+          </w:tcPr>
+          <w:p>
+            <w:r>
+              <w:rPr>
+                <w:sz w:val="18"/>
+              </w:rPr>
+              <w:t>Defect fixing and retesting</w:t>
+            </w:r>
+          </w:p>
+        </w:tc>
+        <w:tc>
+          <w:tcPr>
+            <w:tcW w:w="5177" w:type="dxa"/>
+            <w:vAlign w:val="center"/>
+          </w:tcPr>
+          <w:p>
+            <w:r>
+              <w:rPr>
+                <w:sz w:val="18"/>
+              </w:rPr>
+              <w:t>During test execution</w:t>
+            </w:r>
+          </w:p>
+        </w:tc>
+      </w:tr>
+      <w:tr>
+        <w:trPr>
+          <w:trHeight w:val="289"/>
+          <w:jc w:val="center"/>
+        </w:trPr>
+        <w:tc>
+          <w:tcPr>
+            <w:tcW w:w="5177" w:type="dxa"/>
+            <w:vAlign w:val="center"/>
+          </w:tcPr>
+          <w:p>
+            <w:r>
+              <w:rPr>
+                <w:sz w:val="18"/>
+              </w:rPr>
+              <w:t>Regression testing</w:t>
+            </w:r>
+          </w:p>
+        </w:tc>
+        <w:tc>
+          <w:tcPr>
+            <w:tcW w:w="5177" w:type="dxa"/>
+            <w:vAlign w:val="center"/>
+          </w:tcPr>
+          <w:p>
+            <w:r>
+              <w:rPr>
+                <w:sz w:val="18"/>
+              </w:rPr>
+              <w:t>After major defect fixes</w:t>
+            </w:r>
+          </w:p>
+        </w:tc>
+      </w:tr>
+      <w:tr>
+        <w:trPr>
+          <w:trHeight w:val="257"/>
+          <w:jc w:val="center"/>
+        </w:trPr>
+        <w:tc>
+          <w:tcPr>
+            <w:tcW w:w="5177" w:type="dxa"/>
+            <w:vAlign w:val="center"/>
+          </w:tcPr>
+          <w:p>
+            <w:r>
+              <w:rPr>
+                <w:sz w:val="18"/>
+              </w:rPr>
+              <w:t>Final test summary</w:t>
+            </w:r>
+          </w:p>
+        </w:tc>
+        <w:tc>
+          <w:tcPr>
+            <w:tcW w:w="5177" w:type="dxa"/>
+            <w:vAlign w:val="center"/>
+          </w:tcPr>
+          <w:p>
+            <w:r>
+              <w:rPr>
+                <w:sz w:val="18"/>
+              </w:rPr>
+              <w:t>After completion of testing</w:t>
+            </w:r>
+          </w:p>
+        </w:tc>
+      </w:tr>
+    </w:tbl>
+    <w:p>
+      <w:pPr>
+        <w:spacing w:after="0"/>
+      </w:pPr>
+    </w:p>
+    <w:p>
+      <w:r>
+        <w:t>Exact dates can be filled in once the team's project schedule is finalized.</w:t>
+      </w:r>
+    </w:p>
+    <w:p>
+      <w:pPr>
+        <w:pStyle w:val="Heading1"/>
+      </w:pPr>
+      <w:r>
+        <w:t>8. Test Deliverables</w:t>
+      </w:r>
+    </w:p>
+    <w:p>
+      <w:pPr>
+        <w:pStyle w:val="ListBullet"/>
+        <w:spacing w:after="40"/>
+      </w:pPr>
+      <w:r>
+        <w:t>Software Test Plan (STP)</w:t>
+      </w:r>
+    </w:p>
+    <w:p>
+      <w:pPr>
+        <w:pStyle w:val="ListBullet"/>
+        <w:spacing w:after="40"/>
+      </w:pPr>
+      <w:r>
+        <w:t>Test Cases</w:t>
+      </w:r>
+    </w:p>
+    <w:p>
+      <w:pPr>
+        <w:pStyle w:val="ListBullet"/>
+        <w:spacing w:after="40"/>
+      </w:pPr>
+      <w:r>
+        <w:t>Test Data</w:t>
+      </w:r>
+    </w:p>
+    <w:p>
+      <w:pPr>
+        <w:pStyle w:val="ListBullet"/>
+        <w:spacing w:after="40"/>
+      </w:pPr>
+      <w:r>
+        <w:t>Test Execution Results</w:t>
+      </w:r>
+    </w:p>
+    <w:p>
+      <w:pPr>
+        <w:pStyle w:val="ListBullet"/>
+        <w:spacing w:after="40"/>
+      </w:pPr>
+      <w:r>
+        <w:t>Defect Reports</w:t>
+      </w:r>
+    </w:p>
+    <w:p>
+      <w:pPr>
+        <w:pStyle w:val="ListBullet"/>
+        <w:spacing w:after="40"/>
+      </w:pPr>
+      <w:r>
+        <w:t>Requirement Traceability Matrix (RTM)</w:t>
+      </w:r>
+    </w:p>
+    <w:p>
+      <w:pPr>
+        <w:pStyle w:val="ListBullet"/>
+        <w:spacing w:after="40"/>
+      </w:pPr>
+      <w:r>
+        <w:t>Test Summary Report</w:t>
+      </w:r>
+    </w:p>
+    <w:p>
+      <w:pPr>
+        <w:pStyle w:val="ListBullet"/>
+        <w:numPr>
+          <w:ilvl w:val="0"/>
+          <w:numId w:val="0"/>
+        </w:numPr>
+        <w:spacing w:after="40"/>
+        <w:ind w:left="360"/>
+      </w:pPr>
+    </w:p>
+    <w:p>
+      <w:pPr>
         <w:pStyle w:val="Heading1"/>
       </w:pPr>
       <w:r>
@@ -1893,6 +2589,7 @@
               <w:rPr>
                 <w:sz w:val="18"/>
               </w:rPr>
+              <w:lastRenderedPageBreak/>
               <w:t>Team member availability issues</w:t>
             </w:r>
           </w:p>
@@ -2028,7 +2725,6 @@
         <w:spacing w:after="40"/>
       </w:pPr>
       <w:r>
-        <w:lastRenderedPageBreak/>
         <w:t>A major system failure prevents meaningful testing.</w:t>
       </w:r>
     </w:p>
@@ -2074,6 +2770,549 @@
       </w:pPr>
       <w:r>
         <w:t>A stable build is provided for testing.</w:t>
+      </w:r>
+    </w:p>
+    <w:p>
+      <w:pPr>
+        <w:jc w:val="center"/>
+      </w:pPr>
+    </w:p>
+    <w:p>
+      <w:pPr>
+        <w:pStyle w:val="Heading1"/>
+      </w:pPr>
+      <w:r>
+        <w:t>13. Test Case Management &amp; Traceability</w:t>
+      </w:r>
+    </w:p>
+    <w:p>
+      <w:r>
+        <w:t>The Requirement Traceability Matrix (RTM) will be used to map each SRS requirement to its corresponding test cases.</w:t>
+      </w:r>
+    </w:p>
+    <w:p>
+      <w:r>
+        <w:t>The 15 functional requirements will be traced as follows:</w:t>
+      </w:r>
+    </w:p>
+    <w:tbl>
+      <w:tblPr>
+        <w:tblStyle w:val="TableGridLight"/>
+        <w:tblW w:w="0" w:type="auto"/>
+        <w:tblLook w:val="04A0" w:firstRow="1" w:lastRow="0" w:firstColumn="1" w:lastColumn="0" w:noHBand="0" w:noVBand="1"/>
+      </w:tblPr>
+      <w:tblGrid>
+        <w:gridCol w:w="5043"/>
+        <w:gridCol w:w="5027"/>
+      </w:tblGrid>
+      <w:tr>
+        <w:trPr>
+          <w:trHeight w:val="254"/>
+        </w:trPr>
+        <w:tc>
+          <w:tcPr>
+            <w:tcW w:w="5117" w:type="dxa"/>
+          </w:tcPr>
+          <w:p>
+            <w:r>
+              <w:rPr>
+                <w:b/>
+                <w:sz w:val="18"/>
+              </w:rPr>
+              <w:t>SRS Requirement</w:t>
+            </w:r>
+          </w:p>
+        </w:tc>
+        <w:tc>
+          <w:tcPr>
+            <w:tcW w:w="5117" w:type="dxa"/>
+          </w:tcPr>
+          <w:p>
+            <w:r>
+              <w:rPr>
+                <w:b/>
+                <w:sz w:val="18"/>
+              </w:rPr>
+              <w:t>Test Case Examples</w:t>
+            </w:r>
+          </w:p>
+        </w:tc>
+      </w:tr>
+      <w:tr>
+        <w:trPr>
+          <w:trHeight w:val="254"/>
+        </w:trPr>
+        <w:tc>
+          <w:tcPr>
+            <w:tcW w:w="5117" w:type="dxa"/>
+          </w:tcPr>
+          <w:p>
+            <w:r>
+              <w:rPr>
+                <w:sz w:val="18"/>
+              </w:rPr>
+              <w:t>REQ-01 – User registration</w:t>
+            </w:r>
+          </w:p>
+        </w:tc>
+        <w:tc>
+          <w:tcPr>
+            <w:tcW w:w="5117" w:type="dxa"/>
+          </w:tcPr>
+          <w:p>
+            <w:r>
+              <w:rPr>
+                <w:sz w:val="18"/>
+              </w:rPr>
+              <w:t>TC-REG-01, TC-REG-02</w:t>
+            </w:r>
+          </w:p>
+        </w:tc>
+      </w:tr>
+      <w:tr>
+        <w:trPr>
+          <w:trHeight w:val="254"/>
+        </w:trPr>
+        <w:tc>
+          <w:tcPr>
+            <w:tcW w:w="5117" w:type="dxa"/>
+          </w:tcPr>
+          <w:p>
+            <w:r>
+              <w:rPr>
+                <w:sz w:val="18"/>
+              </w:rPr>
+              <w:t>REQ-02 – Registration validation</w:t>
+            </w:r>
+          </w:p>
+        </w:tc>
+        <w:tc>
+          <w:tcPr>
+            <w:tcW w:w="5117" w:type="dxa"/>
+          </w:tcPr>
+          <w:p>
+            <w:r>
+              <w:rPr>
+                <w:sz w:val="18"/>
+              </w:rPr>
+              <w:t>TC-REG-03, TC-REG-04</w:t>
+            </w:r>
+          </w:p>
+        </w:tc>
+      </w:tr>
+      <w:tr>
+        <w:trPr>
+          <w:trHeight w:val="254"/>
+        </w:trPr>
+        <w:tc>
+          <w:tcPr>
+            <w:tcW w:w="5117" w:type="dxa"/>
+          </w:tcPr>
+          <w:p>
+            <w:r>
+              <w:rPr>
+                <w:sz w:val="18"/>
+              </w:rPr>
+              <w:t>REQ-03 – Login/logout</w:t>
+            </w:r>
+          </w:p>
+        </w:tc>
+        <w:tc>
+          <w:tcPr>
+            <w:tcW w:w="5117" w:type="dxa"/>
+          </w:tcPr>
+          <w:p>
+            <w:r>
+              <w:rPr>
+                <w:sz w:val="18"/>
+              </w:rPr>
+              <w:t>TC-AUTH-01, TC-AUTH-02</w:t>
+            </w:r>
+          </w:p>
+        </w:tc>
+      </w:tr>
+      <w:tr>
+        <w:trPr>
+          <w:trHeight w:val="254"/>
+        </w:trPr>
+        <w:tc>
+          <w:tcPr>
+            <w:tcW w:w="5117" w:type="dxa"/>
+          </w:tcPr>
+          <w:p>
+            <w:r>
+              <w:rPr>
+                <w:sz w:val="18"/>
+              </w:rPr>
+              <w:t>REQ-04 – Book search</w:t>
+            </w:r>
+          </w:p>
+        </w:tc>
+        <w:tc>
+          <w:tcPr>
+            <w:tcW w:w="5117" w:type="dxa"/>
+          </w:tcPr>
+          <w:p>
+            <w:r>
+              <w:rPr>
+                <w:sz w:val="18"/>
+              </w:rPr>
+              <w:t>TC-SEARCH-01, TC-SEARCH-02</w:t>
+            </w:r>
+          </w:p>
+        </w:tc>
+      </w:tr>
+      <w:tr>
+        <w:trPr>
+          <w:trHeight w:val="254"/>
+        </w:trPr>
+        <w:tc>
+          <w:tcPr>
+            <w:tcW w:w="5117" w:type="dxa"/>
+          </w:tcPr>
+          <w:p>
+            <w:r>
+              <w:rPr>
+                <w:sz w:val="18"/>
+              </w:rPr>
+              <w:t>REQ-05 – Book details</w:t>
+            </w:r>
+          </w:p>
+        </w:tc>
+        <w:tc>
+          <w:tcPr>
+            <w:tcW w:w="5117" w:type="dxa"/>
+          </w:tcPr>
+          <w:p>
+            <w:r>
+              <w:rPr>
+                <w:sz w:val="18"/>
+              </w:rPr>
+              <w:t>TC-BOOK-01, TC-BOOK-02</w:t>
+            </w:r>
+          </w:p>
+        </w:tc>
+      </w:tr>
+      <w:tr>
+        <w:trPr>
+          <w:trHeight w:val="269"/>
+        </w:trPr>
+        <w:tc>
+          <w:tcPr>
+            <w:tcW w:w="5117" w:type="dxa"/>
+          </w:tcPr>
+          <w:p>
+            <w:r>
+              <w:rPr>
+                <w:sz w:val="18"/>
+              </w:rPr>
+              <w:t>REQ-06 – Seller listings</w:t>
+            </w:r>
+          </w:p>
+        </w:tc>
+        <w:tc>
+          <w:tcPr>
+            <w:tcW w:w="5117" w:type="dxa"/>
+          </w:tcPr>
+          <w:p>
+            <w:r>
+              <w:rPr>
+                <w:sz w:val="18"/>
+              </w:rPr>
+              <w:t>TC-SELL-01, TC-SELL-02</w:t>
+            </w:r>
+          </w:p>
+        </w:tc>
+      </w:tr>
+      <w:tr>
+        <w:trPr>
+          <w:trHeight w:val="254"/>
+        </w:trPr>
+        <w:tc>
+          <w:tcPr>
+            <w:tcW w:w="5117" w:type="dxa"/>
+          </w:tcPr>
+          <w:p>
+            <w:r>
+              <w:rPr>
+                <w:sz w:val="18"/>
+              </w:rPr>
+              <w:t>REQ-07 – Shopping cart</w:t>
+            </w:r>
+          </w:p>
+        </w:tc>
+        <w:tc>
+          <w:tcPr>
+            <w:tcW w:w="5117" w:type="dxa"/>
+          </w:tcPr>
+          <w:p>
+            <w:r>
+              <w:rPr>
+                <w:sz w:val="18"/>
+              </w:rPr>
+              <w:t>TC-CART-01, TC-CART-02</w:t>
+            </w:r>
+          </w:p>
+        </w:tc>
+      </w:tr>
+      <w:tr>
+        <w:trPr>
+          <w:trHeight w:val="254"/>
+        </w:trPr>
+        <w:tc>
+          <w:tcPr>
+            <w:tcW w:w="5117" w:type="dxa"/>
+          </w:tcPr>
+          <w:p>
+            <w:r>
+              <w:rPr>
+                <w:sz w:val="18"/>
+              </w:rPr>
+              <w:t>REQ-08 – Cart total/availability</w:t>
+            </w:r>
+          </w:p>
+        </w:tc>
+        <w:tc>
+          <w:tcPr>
+            <w:tcW w:w="5117" w:type="dxa"/>
+          </w:tcPr>
+          <w:p>
+            <w:r>
+              <w:rPr>
+                <w:sz w:val="18"/>
+              </w:rPr>
+              <w:t>TC-CART-03, TC-CART-04</w:t>
+            </w:r>
+          </w:p>
+        </w:tc>
+      </w:tr>
+      <w:tr>
+        <w:trPr>
+          <w:trHeight w:val="254"/>
+        </w:trPr>
+        <w:tc>
+          <w:tcPr>
+            <w:tcW w:w="5117" w:type="dxa"/>
+          </w:tcPr>
+          <w:p>
+            <w:r>
+              <w:rPr>
+                <w:sz w:val="18"/>
+              </w:rPr>
+              <w:t>REQ-09 – Order placement</w:t>
+            </w:r>
+          </w:p>
+        </w:tc>
+        <w:tc>
+          <w:tcPr>
+            <w:tcW w:w="5117" w:type="dxa"/>
+          </w:tcPr>
+          <w:p>
+            <w:r>
+              <w:rPr>
+                <w:sz w:val="18"/>
+              </w:rPr>
+              <w:t>TC-ORDER-01, TC-ORDER-02</w:t>
+            </w:r>
+          </w:p>
+        </w:tc>
+      </w:tr>
+      <w:tr>
+        <w:trPr>
+          <w:trHeight w:val="254"/>
+        </w:trPr>
+        <w:tc>
+          <w:tcPr>
+            <w:tcW w:w="5117" w:type="dxa"/>
+          </w:tcPr>
+          <w:p>
+            <w:r>
+              <w:rPr>
+                <w:sz w:val="18"/>
+              </w:rPr>
+              <w:t>REQ-10 – Payment</w:t>
+            </w:r>
+          </w:p>
+        </w:tc>
+        <w:tc>
+          <w:tcPr>
+            <w:tcW w:w="5117" w:type="dxa"/>
+          </w:tcPr>
+          <w:p>
+            <w:r>
+              <w:rPr>
+                <w:sz w:val="18"/>
+              </w:rPr>
+              <w:t>TC-PAY-01, TC-PAY-02</w:t>
+            </w:r>
+          </w:p>
+        </w:tc>
+      </w:tr>
+      <w:tr>
+        <w:trPr>
+          <w:trHeight w:val="254"/>
+        </w:trPr>
+        <w:tc>
+          <w:tcPr>
+            <w:tcW w:w="5117" w:type="dxa"/>
+          </w:tcPr>
+          <w:p>
+            <w:r>
+              <w:rPr>
+                <w:sz w:val="18"/>
+              </w:rPr>
+              <w:t>REQ-11 – Order history/management</w:t>
+            </w:r>
+          </w:p>
+        </w:tc>
+        <w:tc>
+          <w:tcPr>
+            <w:tcW w:w="5117" w:type="dxa"/>
+          </w:tcPr>
+          <w:p>
+            <w:r>
+              <w:rPr>
+                <w:sz w:val="18"/>
+              </w:rPr>
+              <w:t>TC-ORDER-03, TC-ORDER-04</w:t>
+            </w:r>
+          </w:p>
+        </w:tc>
+      </w:tr>
+      <w:tr>
+        <w:trPr>
+          <w:trHeight w:val="254"/>
+        </w:trPr>
+        <w:tc>
+          <w:tcPr>
+            <w:tcW w:w="5117" w:type="dxa"/>
+          </w:tcPr>
+          <w:p>
+            <w:r>
+              <w:rPr>
+                <w:sz w:val="18"/>
+              </w:rPr>
+              <w:t>REQ-12 – Ratings/reviews</w:t>
+            </w:r>
+          </w:p>
+        </w:tc>
+        <w:tc>
+          <w:tcPr>
+            <w:tcW w:w="5117" w:type="dxa"/>
+          </w:tcPr>
+          <w:p>
+            <w:r>
+              <w:rPr>
+                <w:sz w:val="18"/>
+              </w:rPr>
+              <w:t>TC-REV-01, TC-REV-02</w:t>
+            </w:r>
+          </w:p>
+        </w:tc>
+      </w:tr>
+      <w:tr>
+        <w:trPr>
+          <w:trHeight w:val="254"/>
+        </w:trPr>
+        <w:tc>
+          <w:tcPr>
+            <w:tcW w:w="5117" w:type="dxa"/>
+          </w:tcPr>
+          <w:p>
+            <w:r>
+              <w:rPr>
+                <w:sz w:val="18"/>
+              </w:rPr>
+              <w:lastRenderedPageBreak/>
+              <w:t>REQ-13 – Review validation</w:t>
+            </w:r>
+          </w:p>
+        </w:tc>
+        <w:tc>
+          <w:tcPr>
+            <w:tcW w:w="5117" w:type="dxa"/>
+          </w:tcPr>
+          <w:p>
+            <w:r>
+              <w:rPr>
+                <w:sz w:val="18"/>
+              </w:rPr>
+              <w:t>TC-REV-03, TC-REV-04</w:t>
+            </w:r>
+          </w:p>
+        </w:tc>
+      </w:tr>
+      <w:tr>
+        <w:trPr>
+          <w:trHeight w:val="254"/>
+        </w:trPr>
+        <w:tc>
+          <w:tcPr>
+            <w:tcW w:w="5117" w:type="dxa"/>
+          </w:tcPr>
+          <w:p>
+            <w:r>
+              <w:rPr>
+                <w:sz w:val="18"/>
+              </w:rPr>
+              <w:t>REQ-14 – Administrator management</w:t>
+            </w:r>
+          </w:p>
+        </w:tc>
+        <w:tc>
+          <w:tcPr>
+            <w:tcW w:w="5117" w:type="dxa"/>
+          </w:tcPr>
+          <w:p>
+            <w:r>
+              <w:rPr>
+                <w:sz w:val="18"/>
+              </w:rPr>
+              <w:t>TC-ADMIN-01, TC-ADMIN-02</w:t>
+            </w:r>
+          </w:p>
+        </w:tc>
+      </w:tr>
+      <w:tr>
+        <w:trPr>
+          <w:trHeight w:val="254"/>
+        </w:trPr>
+        <w:tc>
+          <w:tcPr>
+            <w:tcW w:w="5117" w:type="dxa"/>
+          </w:tcPr>
+          <w:p>
+            <w:r>
+              <w:rPr>
+                <w:sz w:val="18"/>
+              </w:rPr>
+              <w:t>REQ-15 – Administrator authorization</w:t>
+            </w:r>
+          </w:p>
+        </w:tc>
+        <w:tc>
+          <w:tcPr>
+            <w:tcW w:w="5117" w:type="dxa"/>
+          </w:tcPr>
+          <w:p>
+            <w:r>
+              <w:rPr>
+                <w:sz w:val="18"/>
+              </w:rPr>
+              <w:t>TC-ADMIN-03, TC-ADMIN-04</w:t>
+            </w:r>
+          </w:p>
+        </w:tc>
+      </w:tr>
+    </w:tbl>
+    <w:p>
+      <w:pPr>
+        <w:spacing w:after="0"/>
+      </w:pPr>
+    </w:p>
+    <w:p>
+      <w:r>
+        <w:t>The complete test-case document will contain the required number of Unit, Integration, and System test cases for each functional requirement.</w:t>
       </w:r>
     </w:p>
     <w:p>

</xml_diff>